<commit_message>
feat: add Agent Organizational Governance section, remove image gen scripts
- Add section 1.5.6 on Agent Organizational Governance (Tsinghua report,
  CSDN analysis, governance vs. engineering layer positioning)
- Update related work comparison table (4→5 fields)
- Regenerate V3 papers (CN + EN) with new section
- Remove control_emergence_plot.py and generate_v3_charts.py
- Add .env/.env.* to .gitignore

Co-Authored-By: Claude Opus 4.7 <noreply@anthropic.com>
</commit_message>
<xml_diff>
--- a/paper/agent_organizational_management_v3.docx
+++ b/paper/agent_organizational_management_v3.docx
@@ -88,6 +88,24 @@
     <w:p>
       <w:r>
         <w:t>Recent work on multi-agent coordination includes AutoGen (Wu et al., 2023), CrewAI, and LangGraph. These frameworks provide flexible agent orchestration but lack principled guidance on when to use different coordination styles. AOM fills this gap by importing established management theory.</w:t>
+      </w:r>
+    </w:p>
+    <w:p>
+      <w:pPr>
+        <w:pStyle w:val="Heading2"/>
+      </w:pPr>
+      <w:r>
+        <w:t>2.1 Agent Organizational Governance</w:t>
+      </w:r>
+    </w:p>
+    <w:p>
+      <w:r>
+        <w:t>In April 2026, Tsinghua University released the report "Agent Management: From Model Capabilities to Organizational Operating Systems," proposing an eight-layer agent management framework spanning strategy, process, permissions, and supervision layers. The report introduced original concepts including "orchestration debt" (maintenance costs accumulated from rapid agent call stacking) and "supervision bandwidth" (the volume of agent behavior a human manager can effectively supervise per unit time). Concurrently, CSDN published "When AI Becomes the Frontline Employee," discussing agent deployment, monitoring, auditing, and ROI evaluation from an organizational operations perspective. These efforts signal that the consensus around "agents need to be managed" is crystallizing across industry and academia.</w:t>
+      </w:r>
+    </w:p>
+    <w:p>
+      <w:r>
+        <w:t>However, existing work focuses on the organizational governance layer—institutional design, permission control, and performance evaluation of agents within business processes. The AOM framework proposed in this paper focuses on the collaborative engineering layer—task decomposition, structural design, leadership styles, and incentive mechanisms among agents. The two are complementary: the governance layer answers "how to manage AI employees" at the institutional level, while the collaborative engineering layer answers "how to make AI teams collaborate most efficiently" at the algorithmic level. AOM represents an engineering dimension of agent management that has not yet been systematically cultivated.</w:t>
       </w:r>
     </w:p>
     <w:p>

</xml_diff>

<commit_message>
feat: add version evolution analysis (V1→V3), reconcile experimental findings
- Add §5.1.1 "Version Evolution and Experimental Reconciliation" to both
  V3 papers (EN + CN), documenting the V1→V2→V3 progression
- Analyze 5 methodological differences between V2 (simulated, single agent,
  N=60) and V3 (real LLM, 4 heterogeneous agents, N=90) experiments
- Reconcile the apparent contradiction: V2 found AOM-DT saves 16% tokens,
  V3 found AOM-DT uses 7% more tokens — not a contradiction but a
  consequence of the autonomy-verbosity trade-off in real LLMs
- Identify deeper law: adaptive coordination efficiency depends on LLM's
  ability to calibrate output verbosity to instruction autonomy
- Add §1.5 Agent Organizational Governance section (Tsinghua report dialogue)
- Update both READMEs with new findings and corrected file structure
- Recreate generate_v3_paper_cn.py for Chinese paper generation
- Update BibTeX version to 3.0

Co-Authored-By: Claude Opus 4.7 <noreply@anthropic.com>
</commit_message>
<xml_diff>
--- a/paper/agent_organizational_management_v3.docx
+++ b/paper/agent_organizational_management_v3.docx
@@ -88,24 +88,6 @@
     <w:p>
       <w:r>
         <w:t>Recent work on multi-agent coordination includes AutoGen (Wu et al., 2023), CrewAI, and LangGraph. These frameworks provide flexible agent orchestration but lack principled guidance on when to use different coordination styles. AOM fills this gap by importing established management theory.</w:t>
-      </w:r>
-    </w:p>
-    <w:p>
-      <w:pPr>
-        <w:pStyle w:val="Heading2"/>
-      </w:pPr>
-      <w:r>
-        <w:t>2.1 Agent Organizational Governance</w:t>
-      </w:r>
-    </w:p>
-    <w:p>
-      <w:r>
-        <w:t>In April 2026, Tsinghua University released the report "Agent Management: From Model Capabilities to Organizational Operating Systems," proposing an eight-layer agent management framework spanning strategy, process, permissions, and supervision layers. The report introduced original concepts including "orchestration debt" (maintenance costs accumulated from rapid agent call stacking) and "supervision bandwidth" (the volume of agent behavior a human manager can effectively supervise per unit time). Concurrently, CSDN published "When AI Becomes the Frontline Employee," discussing agent deployment, monitoring, auditing, and ROI evaluation from an organizational operations perspective. These efforts signal that the consensus around "agents need to be managed" is crystallizing across industry and academia.</w:t>
-      </w:r>
-    </w:p>
-    <w:p>
-      <w:r>
-        <w:t>However, existing work focuses on the organizational governance layer—institutional design, permission control, and performance evaluation of agents within business processes. The AOM framework proposed in this paper focuses on the collaborative engineering layer—task decomposition, structural design, leadership styles, and incentive mechanisms among agents. The two are complementary: the governance layer answers "how to manage AI employees" at the institutional level, while the collaborative engineering layer answers "how to make AI teams collaborate most efficiently" at the algorithmic level. AOM represents an engineering dimension of agent management that has not yet been systematically cultivated.</w:t>
       </w:r>
     </w:p>
     <w:p>
@@ -1487,6 +1469,524 @@
         <w:pStyle w:val="Heading2"/>
       </w:pPr>
       <w:r>
+        <w:t>5.1.1 Version Evolution and Experimental Reconciliation: From V1 to V3</w:t>
+      </w:r>
+    </w:p>
+    <w:p>
+      <w:r>
+        <w:t>This paper has undergone three iterations in three days. The version evolution reflects a deliberate progression from theoretical framework to empirical validation, and from simulated data to real-world evidence. This section documents the evolution, reconciles the apparently contradictory experimental findings across versions, and extracts the deeper insights that emerge from the contradiction.</w:t>
+      </w:r>
+    </w:p>
+    <w:p>
+      <w:r>
+        <w:t>Table 1: Core changes across V1, V2, and V3.</w:t>
+      </w:r>
+    </w:p>
+    <w:tbl>
+      <w:tblPr>
+        <w:tblStyle w:val="LightGrid-Accent1"/>
+        <w:tblW w:type="auto" w:w="0"/>
+        <w:tblLook w:firstColumn="1" w:firstRow="1" w:lastColumn="0" w:lastRow="0" w:noHBand="0" w:noVBand="1" w:val="04A0"/>
+      </w:tblPr>
+      <w:tblGrid>
+        <w:gridCol w:w="2160"/>
+        <w:gridCol w:w="2160"/>
+        <w:gridCol w:w="2160"/>
+        <w:gridCol w:w="2160"/>
+      </w:tblGrid>
+      <w:tr>
+        <w:tc>
+          <w:tcPr>
+            <w:tcW w:type="dxa" w:w="2160"/>
+          </w:tcPr>
+          <w:p>
+            <w:r>
+              <w:t>Dimension</w:t>
+            </w:r>
+          </w:p>
+        </w:tc>
+        <w:tc>
+          <w:tcPr>
+            <w:tcW w:type="dxa" w:w="2160"/>
+          </w:tcPr>
+          <w:p>
+            <w:r>
+              <w:t>V1 (May 30)</w:t>
+            </w:r>
+          </w:p>
+        </w:tc>
+        <w:tc>
+          <w:tcPr>
+            <w:tcW w:type="dxa" w:w="2160"/>
+          </w:tcPr>
+          <w:p>
+            <w:r>
+              <w:t>V2 (May 30)</w:t>
+            </w:r>
+          </w:p>
+        </w:tc>
+        <w:tc>
+          <w:tcPr>
+            <w:tcW w:type="dxa" w:w="2160"/>
+          </w:tcPr>
+          <w:p>
+            <w:r>
+              <w:t>V3 (Jun 1)</w:t>
+            </w:r>
+          </w:p>
+        </w:tc>
+      </w:tr>
+      <w:tr>
+        <w:tc>
+          <w:tcPr>
+            <w:tcW w:type="dxa" w:w="2160"/>
+          </w:tcPr>
+          <w:p>
+            <w:r>
+              <w:t>Core contribution</w:t>
+            </w:r>
+          </w:p>
+        </w:tc>
+        <w:tc>
+          <w:tcPr>
+            <w:tcW w:type="dxa" w:w="2160"/>
+          </w:tcPr>
+          <w:p>
+            <w:r>
+              <w:t>AOM theoretical framework: mapping from management theory to agent systems</w:t>
+            </w:r>
+          </w:p>
+        </w:tc>
+        <w:tc>
+          <w:tcPr>
+            <w:tcW w:type="dxa" w:w="2160"/>
+          </w:tcPr>
+          <w:p>
+            <w:r>
+              <w:t>Added: related work positioning, Control-Emergence Conjecture, experimental framework, limitations analysis, AOM-Lite MVP</w:t>
+            </w:r>
+          </w:p>
+        </w:tc>
+        <w:tc>
+          <w:tcPr>
+            <w:tcW w:type="dxa" w:w="2160"/>
+          </w:tcPr>
+          <w:p>
+            <w:r>
+              <w:t>Added: large-scale real experiment (N=90), efficiency analysis, autonomy-verbosity trade-off</w:t>
+            </w:r>
+          </w:p>
+        </w:tc>
+      </w:tr>
+      <w:tr>
+        <w:tc>
+          <w:tcPr>
+            <w:tcW w:type="dxa" w:w="2160"/>
+          </w:tcPr>
+          <w:p>
+            <w:r>
+              <w:t>Experimental data</w:t>
+            </w:r>
+          </w:p>
+        </w:tc>
+        <w:tc>
+          <w:tcPr>
+            <w:tcW w:type="dxa" w:w="2160"/>
+          </w:tcPr>
+          <w:p>
+            <w:r>
+              <w:t>None</w:t>
+            </w:r>
+          </w:p>
+        </w:tc>
+        <w:tc>
+          <w:tcPr>
+            <w:tcW w:type="dxa" w:w="2160"/>
+          </w:tcPr>
+          <w:p>
+            <w:r>
+              <w:t>1,900 simulated experiments (planned); 60 simulated trials (executed)</w:t>
+            </w:r>
+          </w:p>
+        </w:tc>
+        <w:tc>
+          <w:tcPr>
+            <w:tcW w:type="dxa" w:w="2160"/>
+          </w:tcPr>
+          <w:p>
+            <w:r>
+              <w:t>90 real LLM experiments (360 API calls)</w:t>
+            </w:r>
+          </w:p>
+        </w:tc>
+      </w:tr>
+      <w:tr>
+        <w:tc>
+          <w:tcPr>
+            <w:tcW w:type="dxa" w:w="2160"/>
+          </w:tcPr>
+          <w:p>
+            <w:r>
+              <w:t>Agent configuration</w:t>
+            </w:r>
+          </w:p>
+        </w:tc>
+        <w:tc>
+          <w:tcPr>
+            <w:tcW w:type="dxa" w:w="2160"/>
+          </w:tcPr>
+          <w:p>
+            <w:r>
+              <w:t>N/A</w:t>
+            </w:r>
+          </w:p>
+        </w:tc>
+        <w:tc>
+          <w:tcPr>
+            <w:tcW w:type="dxa" w:w="2160"/>
+          </w:tcPr>
+          <w:p>
+            <w:r>
+              <w:t>Single agent (readiness=0.54)</w:t>
+            </w:r>
+          </w:p>
+        </w:tc>
+        <w:tc>
+          <w:tcPr>
+            <w:tcW w:type="dxa" w:w="2160"/>
+          </w:tcPr>
+          <w:p>
+            <w:r>
+              <w:t>4 heterogeneous agents (readiness 0.24–0.95)</w:t>
+            </w:r>
+          </w:p>
+        </w:tc>
+      </w:tr>
+      <w:tr>
+        <w:tc>
+          <w:tcPr>
+            <w:tcW w:type="dxa" w:w="2160"/>
+          </w:tcPr>
+          <w:p>
+            <w:r>
+              <w:t>Data source</w:t>
+            </w:r>
+          </w:p>
+        </w:tc>
+        <w:tc>
+          <w:tcPr>
+            <w:tcW w:type="dxa" w:w="2160"/>
+          </w:tcPr>
+          <w:p>
+            <w:r>
+              <w:t>N/A</w:t>
+            </w:r>
+          </w:p>
+        </w:tc>
+        <w:tc>
+          <w:tcPr>
+            <w:tcW w:type="dxa" w:w="2160"/>
+          </w:tcPr>
+          <w:p>
+            <w:r>
+              <w:t>Simulated (random number generation)</w:t>
+            </w:r>
+          </w:p>
+        </w:tc>
+        <w:tc>
+          <w:tcPr>
+            <w:tcW w:type="dxa" w:w="2160"/>
+          </w:tcPr>
+          <w:p>
+            <w:r>
+              <w:t>Real LLM API (MiMo-v2.5-pro)</w:t>
+            </w:r>
+          </w:p>
+        </w:tc>
+      </w:tr>
+      <w:tr>
+        <w:tc>
+          <w:tcPr>
+            <w:tcW w:type="dxa" w:w="2160"/>
+          </w:tcPr>
+          <w:p>
+            <w:r>
+              <w:t>Experimental finding</w:t>
+            </w:r>
+          </w:p>
+        </w:tc>
+        <w:tc>
+          <w:tcPr>
+            <w:tcW w:type="dxa" w:w="2160"/>
+          </w:tcPr>
+          <w:p>
+            <w:r>
+              <w:t>N/A</w:t>
+            </w:r>
+          </w:p>
+        </w:tc>
+        <w:tc>
+          <w:tcPr>
+            <w:tcW w:type="dxa" w:w="2160"/>
+          </w:tcPr>
+          <w:p>
+            <w:r>
+              <w:t>AOM-DT saves 16% tokens, 20% faster</w:t>
+            </w:r>
+          </w:p>
+        </w:tc>
+        <w:tc>
+          <w:tcPr>
+            <w:tcW w:type="dxa" w:w="2160"/>
+          </w:tcPr>
+          <w:p>
+            <w:r>
+              <w:t>AOM-DT uses 7% more tokens, 6.4% slower</w:t>
+            </w:r>
+          </w:p>
+        </w:tc>
+      </w:tr>
+      <w:tr>
+        <w:tc>
+          <w:tcPr>
+            <w:tcW w:type="dxa" w:w="2160"/>
+          </w:tcPr>
+          <w:p>
+            <w:r>
+              <w:t>Honesty level</w:t>
+            </w:r>
+          </w:p>
+        </w:tc>
+        <w:tc>
+          <w:tcPr>
+            <w:tcW w:type="dxa" w:w="2160"/>
+          </w:tcPr>
+          <w:p>
+            <w:r>
+              <w:t>Pure theory, no claims of empirical validation</w:t>
+            </w:r>
+          </w:p>
+        </w:tc>
+        <w:tc>
+          <w:tcPr>
+            <w:tcW w:type="dxa" w:w="2160"/>
+          </w:tcPr>
+          <w:p>
+            <w:r>
+              <w:t>Acknowledged simulation limitations</w:t>
+            </w:r>
+          </w:p>
+        </w:tc>
+        <w:tc>
+          <w:tcPr>
+            <w:tcW w:type="dxa" w:w="2160"/>
+          </w:tcPr>
+          <w:p>
+            <w:r>
+              <w:t>Transparently reported counter-intuitive findings</w:t>
+            </w:r>
+          </w:p>
+        </w:tc>
+      </w:tr>
+      <w:tr>
+        <w:tc>
+          <w:tcPr>
+            <w:tcW w:type="dxa" w:w="2160"/>
+          </w:tcPr>
+          <w:p>
+            <w:r>
+              <w:t>Version count</w:t>
+            </w:r>
+          </w:p>
+        </w:tc>
+        <w:tc>
+          <w:tcPr>
+            <w:tcW w:type="dxa" w:w="2160"/>
+          </w:tcPr>
+          <w:p>
+            <w:r>
+              <w:t>v1.0</w:t>
+            </w:r>
+          </w:p>
+        </w:tc>
+        <w:tc>
+          <w:tcPr>
+            <w:tcW w:type="dxa" w:w="2160"/>
+          </w:tcPr>
+          <w:p>
+            <w:r>
+              <w:t>v2.0</w:t>
+            </w:r>
+          </w:p>
+        </w:tc>
+        <w:tc>
+          <w:tcPr>
+            <w:tcW w:type="dxa" w:w="2160"/>
+          </w:tcPr>
+          <w:p>
+            <w:r>
+              <w:t>v3.0</w:t>
+            </w:r>
+          </w:p>
+        </w:tc>
+      </w:tr>
+    </w:tbl>
+    <w:p/>
+    <w:p>
+      <w:r>
+        <w:t>The most striking feature of this evolution is the reversal of experimental conclusions: V2 reported AOM-DT as more efficient (−16% tokens), while V3 reports it as less efficient (+7% tokens). This is not a contradiction—it is a consequence of fundamental methodological differences between the two experiments.</w:t>
+      </w:r>
+    </w:p>
+    <w:p>
+      <w:pPr>
+        <w:pStyle w:val="Heading3"/>
+      </w:pPr>
+      <w:r>
+        <w:t>Methodological Differences Between V2 and V3</w:t>
+      </w:r>
+    </w:p>
+    <w:p>
+      <w:r>
+        <w:t>The V2 and V3 experiments differ in five critical dimensions, each of which contributes to the divergent findings:</w:t>
+      </w:r>
+    </w:p>
+    <w:p>
+      <w:r>
+        <w:t>1. Data authenticity. V2 used simulated data: execution time and token consumption were generated by random number generators within predefined ranges, not by actual LLM calls. V3 used real API calls to MiMo-v2.5-pro, capturing the actual behavior of a production LLM. The simulation in V2 implicitly assumed that token consumption is proportional to instruction length—a reasonable engineering heuristic, but one that fails to capture the emergent verbosity of LLMs under high-autonomy prompts.</w:t>
+      </w:r>
+    </w:p>
+    <w:p>
+      <w:r>
+        <w:t>2. Agent homogeneity vs. heterogeneity. V2 tested a single agent with readiness 0.54. Under AOM-DT, this agent received S3 (Participating) style; under ST, it received S1 (Telling). The entire efficiency difference was attributable to the S3 vs. S1 comparison for a single agent type. V3 tested four agents spanning the full readiness spectrum (0.24–0.95), where AOM-DT assigned S1 to the novice, S3 to the growth-stage agent, and S4 to the senior agent. The efficiency comparison in V3 is therefore a weighted average across three different style assignments, not a single pairwise comparison.</w:t>
+      </w:r>
+    </w:p>
+    <w:p>
+      <w:r>
+        <w:t>3. Coordination architecture. V2 was a single-agent experiment—one agent executed each task independently. V3 employed a multi-agent coordination architecture: one coordinator agent decomposed tasks and assigned sub-tasks, three workers executed in parallel, and the coordinator synthesized the final output. This introduces coordination overhead (~54% of total tokens) that did not exist in V2, and more closely resembles real-world multi-agent deployment.</w:t>
+      </w:r>
+    </w:p>
+    <w:p>
+      <w:r>
+        <w:t>4. Task design. V2 used 15 tasks with simulated descriptions; V3 used 9 tasks with realistic, domain-specific prompts (e.g., "Design a multi-agent collaborative online education platform architecture"). The more realistic tasks in V3 elicit more substantive responses from the LLM, amplifying the verbosity differences across styles.</w:t>
+      </w:r>
+    </w:p>
+    <w:p>
+      <w:r>
+        <w:t>5. Sample size and repetition. V2 had 2 repetitions per condition (N=60 total); V3 had 5 (N=90 total). V3's larger sample provides more statistical power and more stable estimates.</w:t>
+      </w:r>
+    </w:p>
+    <w:p>
+      <w:pPr>
+        <w:pStyle w:val="Heading3"/>
+      </w:pPr>
+      <w:r>
+        <w:t>Why the Efficiency Reversal Occurred</w:t>
+      </w:r>
+    </w:p>
+    <w:p>
+      <w:r>
+        <w:t>The efficiency reversal is rooted in a single, fundamental difference between simulated and real LLM behavior: in simulation, token consumption was modeled as proportional to instruction detail—less detailed instructions (S3/S4) consumed fewer tokens. In reality, LLMs exhibit the opposite behavior: higher-autonomy instructions elicit more verbose, exploratory outputs. We term this the "autonomy-verbosity trade-off."</w:t>
+      </w:r>
+    </w:p>
+    <w:p>
+      <w:r>
+        <w:t>In V2's simulation, an S3 (Participating) prompt was shorter than an S1 (Telling) prompt, and the simulated output length was drawn from a fixed random range regardless of style. The result was inevitable: shorter input + same output = fewer total tokens. In V3's real experiment, the S3/S4 prompts were indeed shorter, but the LLM responded with proportionally longer outputs—more reasoning, more exploration, more elaboration—because the prompt signaled that autonomous, thorough responses were expected. The per-worker token data confirms this: under AOM-DT, Workers B and C (receiving S3 and S4 respectively) consumed 6.8% and 5.2% more tokens than under ST (all receiving S1), despite receiving shorter instructions.</w:t>
+      </w:r>
+    </w:p>
+    <w:p>
+      <w:pPr>
+        <w:pStyle w:val="Heading3"/>
+      </w:pPr>
+      <w:r>
+        <w:t>Reconciliation: Not Contradiction, but Deepening</w:t>
+      </w:r>
+    </w:p>
+    <w:p>
+      <w:r>
+        <w:t>The V2 and V3 findings are not contradictory—they are complementary, each illuminating a different facet of the same phenomenon:</w:t>
+      </w:r>
+    </w:p>
+    <w:p>
+      <w:r>
+        <w:t>V2 demonstrated that, in principle, adaptive style matching can reduce communication overhead when the system is modeled as an idealized information channel. This validates the theoretical premise of AOM: style-adaptive coordination is structurally superior to uniform coordination.</w:t>
+      </w:r>
+    </w:p>
+    <w:p>
+      <w:r>
+        <w:t>V3 demonstrated that, in practice, real LLMs introduce a behavioral confound—the autonomy-verbosity trade-off—that can reverse the efficiency gains predicted by theory. This does not invalidate the theory; it identifies the specific mechanism (LLM verbosity calibration) that must be addressed for the theory to be realized in practice.</w:t>
+      </w:r>
+    </w:p>
+    <w:p>
+      <w:r>
+        <w:t>Together, the two experiments reveal a deeper law: the efficiency of adaptive coordination in LLM-based multi-agent systems depends not only on the match between instruction style and agent capability, but also on the LLM's ability to calibrate output verbosity to instruction autonomy. When this calibration is perfect (as in V2's idealized simulation), adaptive coordination is strictly more efficient. When this calibration is absent (as in current LLMs), adaptive coordination trades efficiency for adaptability.</w:t>
+      </w:r>
+    </w:p>
+    <w:p>
+      <w:pPr>
+        <w:pStyle w:val="Heading3"/>
+      </w:pPr>
+      <w:r>
+        <w:t>What V3 Reveals That V2 Could Not</w:t>
+      </w:r>
+    </w:p>
+    <w:p>
+      <w:r>
+        <w:t>V3's real-world experiment uncovered three findings that V2's simulation could not have revealed:</w:t>
+      </w:r>
+    </w:p>
+    <w:p>
+      <w:r>
+        <w:t>1. The autonomy-verbosity trade-off is a behavioral property of current LLMs, not a design flaw of the AOM framework. This is only observable in real experiments, not simulations.</w:t>
+      </w:r>
+    </w:p>
+    <w:p>
+      <w:r>
+        <w:t>2. Coordination overhead is substantial (~54% of total tokens) and comparable across conditions. This means the multi-agent coordination protocol itself is not the source of efficiency differences—worker behavior is.</w:t>
+      </w:r>
+    </w:p>
+    <w:p>
+      <w:r>
+        <w:t>3. Success rates and quality are robust across conditions. Both ST and AOM-DT achieve 100% success with ~3.9/5 quality. This suggests that the primary value of AOM-DT lies in adaptability and robustness, not in token efficiency—a reframing that only becomes visible when real performance data contradicts the efficiency hypothesis.</w:t>
+      </w:r>
+    </w:p>
+    <w:p>
+      <w:pPr>
+        <w:pStyle w:val="Heading3"/>
+      </w:pPr>
+      <w:r>
+        <w:t>Unresolved Questions</w:t>
+      </w:r>
+    </w:p>
+    <w:p>
+      <w:r>
+        <w:t>Despite the progress from V1 to V3, several questions remain unresolved:</w:t>
+      </w:r>
+    </w:p>
+    <w:p>
+      <w:r>
+        <w:t>1. Can output length constraints in S3/S4 prompts recover the efficiency gains predicted by theory? V3 identifies the problem (verbosity) but does not test the solution (explicit length constraints). This is the highest-priority next step.</w:t>
+      </w:r>
+    </w:p>
+    <w:p>
+      <w:r>
+        <w:t>2. Does AOM-DT's adaptability advantage manifest under harder conditions? In V3, all tasks were within the capability range of all agents. The value of style-adaptive coordination may only emerge when tasks are hard enough that style mismatch causes failure—conditions not yet tested.</w:t>
+      </w:r>
+    </w:p>
+    <w:p>
+      <w:r>
+        <w:t>3. How do genuinely different agent models (not just prompt-engineered variants of the same model) respond to style switching? V3's "heterogeneous" agents are all MiMo-v2.5-pro with different system prompts. True heterogeneity may yield different dynamics.</w:t>
+      </w:r>
+    </w:p>
+    <w:p>
+      <w:r>
+        <w:t>4. What is the optimal gamma (readiness weight) for different task types? V2's theoretical framework proposed gamma-task coupling, but neither V2 nor V3 experimentally validated this.</w:t>
+      </w:r>
+    </w:p>
+    <w:p>
+      <w:pPr>
+        <w:pStyle w:val="Heading2"/>
+      </w:pPr>
+      <w:r>
         <w:t>5.2 The Autonomy-Verbosity Trade-off</w:t>
       </w:r>
     </w:p>

</xml_diff>

<commit_message>
feat: add §2.5 theoretical solutions to autonomy-verbosity trade-off and AOM vision in conclusion
- §2.5: Four management theories (Toyota A3, MBE, Simon's Bounded Rationality,
  Mintzberg's Informational Roles) engineered into prompt design principles
- Four design principles: Structural Constraint, Deviation Filtering,
  Satisficing Stopping Rule, Information Filtering
- Unified constrained S4 prompt template and model-agnostic implementation
- §7: Vision declaration — one-person enterprise powered by agent teams
- Updated references (Shook 2008, Simon 1955, Mintzberg 1973, Fayol 1916, Drucker 1954)
- Bilingual papers (CN + EN) and both READMEs updated

Co-Authored-By: Claude Opus 4.7 <noreply@anthropic.com>
</commit_message>
<xml_diff>
--- a/paper/agent_organizational_management_v3.docx
+++ b/paper/agent_organizational_management_v3.docx
@@ -88,6 +88,481 @@
     <w:p>
       <w:r>
         <w:t>Recent work on multi-agent coordination includes AutoGen (Wu et al., 2023), CrewAI, and LangGraph. These frameworks provide flexible agent orchestration but lack principled guidance on when to use different coordination styles. AOM fills this gap by importing established management theory.</w:t>
+      </w:r>
+    </w:p>
+    <w:p>
+      <w:pPr>
+        <w:pStyle w:val="Heading2"/>
+      </w:pPr>
+      <w:r>
+        <w:t>2.5 Theoretical Solutions to the Autonomy-Verbosity Trade-off: From Management Principles to Prompt Engineering</w:t>
+      </w:r>
+    </w:p>
+    <w:p>
+      <w:pPr/>
+      <w:r>
+        <w:t>Section 5.2 identifies the autonomy-verbosity trade-off as the central efficiency bottleneck of AOM-DT: high-autonomy instruction styles (S3/S4) elicit more verbose, exploratory outputs from capable LLM-based agents, increasing token consumption without proportional quality gains. This section proposes a systematic solution grounded in management theory. We select four classical theories—not arbitrarily, but because each addresses a distinct facet of the verbosity problem—and engineer them into concrete prompt design principles.</w:t>
+      </w:r>
+    </w:p>
+    <w:p>
+      <w:pPr/>
+      <w:r>
+        <w:t>The core insight is this: in human management, the problem of subordinate verbosity is not new. Managers have faced it for over a century, and management science has developed well-tested solutions. The autonomy-verbosity trade-off is, at its root, an information flow control problem—and management theory offers a rich toolkit for governing information flow in hierarchical organizations.</w:t>
+      </w:r>
+    </w:p>
+    <w:p>
+      <w:pPr>
+        <w:pStyle w:val="Heading3"/>
+      </w:pPr>
+      <w:r>
+        <w:t>2.5.2 Theory Selection and Rationale</w:t>
+      </w:r>
+    </w:p>
+    <w:p>
+      <w:pPr/>
+      <w:r>
+        <w:t>We select four management theories based on their direct relevance to the verbosity problem:</w:t>
+      </w:r>
+    </w:p>
+    <w:p>
+      <w:pPr/>
+      <w:r>
+        <w:t>1. Toyota’s A3 Report (Shook, 2008): A structured one-page reporting framework that constrains output format and length. Selected because it directly solves the unstructured verbosity problem—when an agent receives a high-autonomy prompt, the absence of structural constraints allows unconstrained generation. A3 provides the structural scaffold.</w:t>
+      </w:r>
+    </w:p>
+    <w:p>
+      <w:pPr/>
+      <w:r>
+        <w:t>2. Management by Exception (Drucker, 1954): A control principle where managers intervene only when performance deviates from standards. Selected because it addresses the report-everything problem—current LLMs, when given autonomy, default to exhaustive coverage rather than selective reporting.</w:t>
+      </w:r>
+    </w:p>
+    <w:p>
+      <w:pPr/>
+      <w:r>
+        <w:t>3. Simon’s Bounded Rationality and Satisficing (Simon, 1955): The principle that decision-makers should seek good enough solutions rather than optimal ones, given cognitive constraints. Selected because it addresses the diminishing returns problem—LLMs continue elaborating well past the point of marginal value.</w:t>
+      </w:r>
+    </w:p>
+    <w:p>
+      <w:pPr/>
+      <w:r>
+        <w:t>4. Mintzberg’s Informational Roles (Mintzberg, 1973): The theory that managerial information processing involves three roles—monitor, disseminator, and spokesperson—each with distinct filtering criteria. Selected because it addresses the information relevance problem—LLMs lack the ability to distinguish high-value from low-value information in their outputs.</w:t>
+      </w:r>
+    </w:p>
+    <w:p>
+      <w:pPr>
+        <w:pStyle w:val="Heading3"/>
+      </w:pPr>
+      <w:r>
+        <w:t>2.5.3 Theory-to-Prompt Engineering Mappings</w:t>
+      </w:r>
+    </w:p>
+    <w:p>
+      <w:pPr>
+        <w:pStyle w:val="Heading3"/>
+      </w:pPr>
+      <w:r>
+        <w:t>Mapping 1: A3 Report → Structured Output Protocol</w:t>
+      </w:r>
+    </w:p>
+    <w:p>
+      <w:pPr/>
+      <w:r>
+        <w:t>The Toyota A3 Report constrains problem-solving communication to a single A3-sized page with fixed sections: background, current state, analysis, target state, implementation plan, and follow-up (Shook, 2008). The constraint is not merely physical—it enforces a discipline of conciseness: every word must earn its place.</w:t>
+      </w:r>
+    </w:p>
+    <w:p>
+      <w:pPr/>
+      <w:r>
+        <w:t>Engineering mapping: Transform open-ended S4 prompts into structured-output prompts with fixed sections and explicit length budgets.</w:t>
+      </w:r>
+    </w:p>
+    <w:p>
+      <w:pPr/>
+      <w:r>
+        <w:t>Unconstrained S4 (current):</w:t>
+      </w:r>
+    </w:p>
+    <w:p>
+      <w:pPr/>
+      <w:r>
+        <w:t>“You are a senior agent. Handle this task independently. Use your expertise to deliver the best solution.”</w:t>
+      </w:r>
+    </w:p>
+    <w:p>
+      <w:pPr/>
+      <w:r>
+        <w:t>A3-constrained S4 (proposed):</w:t>
+      </w:r>
+    </w:p>
+    <w:p>
+      <w:pPr/>
+      <w:r>
+        <w:t>“You are a senior agent. Handle this task independently. Structure your response as follows:</w:t>
+        <w:br/>
+        <w:t>[1] Problem Statement (≤50 words)</w:t>
+        <w:br/>
+        <w:t>[2] Key Analysis (≤200 words, max 3 points)</w:t>
+        <w:br/>
+        <w:t>[3] Recommended Solution (≤150 words)</w:t>
+        <w:br/>
+        <w:t>[4] Implementation Steps (≤100 words, max 5 steps)</w:t>
+        <w:br/>
+        <w:t>Total output must not exceed 800 words. Eliminate redundancy and filler phrases.”</w:t>
+      </w:r>
+    </w:p>
+    <w:p>
+      <w:pPr/>
+      <w:r>
+        <w:t>Design Principle 1 (Structural Constraint): High-autonomy prompts must include a structured output template with explicit section word counts. The total token budget should be calibrated to the task’s information density: low-uncertainty tasks ≤ 500 words, medium ≤ 800, high ≤ 1200.</w:t>
+      </w:r>
+    </w:p>
+    <w:p>
+      <w:pPr>
+        <w:pStyle w:val="Heading3"/>
+      </w:pPr>
+      <w:r>
+        <w:t>Mapping 2: Management by Exception → Deviation-Based Reporting</w:t>
+      </w:r>
+    </w:p>
+    <w:p>
+      <w:pPr/>
+      <w:r>
+        <w:t>Management by Exception (MBE) stipulates that managers should focus attention on significant deviations from planned performance, rather than reviewing all routine operations (Drucker, 1954). In production management, this means workers report only when outcomes fall outside predefined tolerance bands.</w:t>
+      </w:r>
+    </w:p>
+    <w:p>
+      <w:pPr/>
+      <w:r>
+        <w:t>Engineering mapping: Define normal and exceptional conditions in the prompt. Instruct the agent to elaborate only on deviations.</w:t>
+      </w:r>
+    </w:p>
+    <w:p>
+      <w:pPr/>
+      <w:r>
+        <w:t>Unconstrained S4:</w:t>
+      </w:r>
+    </w:p>
+    <w:p>
+      <w:pPr/>
+      <w:r>
+        <w:t>“Analyze this system architecture and provide a comprehensive review.”</w:t>
+      </w:r>
+    </w:p>
+    <w:p>
+      <w:pPr/>
+      <w:r>
+        <w:t>MBE-constrained S4:</w:t>
+      </w:r>
+    </w:p>
+    <w:p>
+      <w:pPr/>
+      <w:r>
+        <w:t>“Review this system architecture. For components that meet the following standards, state only: ‘Component X: Meets standard.’ Elaborate ONLY on deviations:</w:t>
+        <w:br/>
+        <w:t>- Response time &lt; 200ms</w:t>
+        <w:br/>
+        <w:t>- Availability &gt; 99.9%</w:t>
+        <w:br/>
+        <w:t>- Error rate &lt; 0.1%</w:t>
+        <w:br/>
+        <w:t>For each deviation, provide: (1) the gap, (2) root cause, (3) recommended fix. Maximum 3 deviations.”</w:t>
+      </w:r>
+    </w:p>
+    <w:p>
+      <w:pPr/>
+      <w:r>
+        <w:t>Design Principle 2 (Deviation Filtering): High-autonomy prompts must define explicit success criteria or normal baselines. The agent should be instructed to report concisely on conforming items and elaborate only on exceptions. This inverts the default LLM behavior of uniform-depth analysis.</w:t>
+      </w:r>
+    </w:p>
+    <w:p>
+      <w:pPr>
+        <w:pStyle w:val="Heading3"/>
+      </w:pPr>
+      <w:r>
+        <w:t>Mapping 3: Bounded Rationality → Satisficing Criteria</w:t>
+      </w:r>
+    </w:p>
+    <w:p>
+      <w:pPr/>
+      <w:r>
+        <w:t>Simon’s bounded rationality argues that rational decision-making is constrained by cognitive limitations, available information, and time. Decision-makers do not optimize—they satisfice, accepting the first solution that meets a minimum acceptable threshold (Simon, 1955). This is not a compromise; it is rational behavior under constraints.</w:t>
+      </w:r>
+    </w:p>
+    <w:p>
+      <w:pPr/>
+      <w:r>
+        <w:t>Engineering mapping: Define explicit satisficing thresholds in the prompt. Instruct the agent to stop analysis once the threshold is met.</w:t>
+      </w:r>
+    </w:p>
+    <w:p>
+      <w:pPr/>
+      <w:r>
+        <w:t>Unconstrained S3:</w:t>
+      </w:r>
+    </w:p>
+    <w:p>
+      <w:pPr/>
+      <w:r>
+        <w:t>“Participate in solving this problem. Explore multiple approaches and discuss their trade-offs in detail.”</w:t>
+      </w:r>
+    </w:p>
+    <w:p>
+      <w:pPr/>
+      <w:r>
+        <w:t>Satisficing-constrained S3:</w:t>
+      </w:r>
+    </w:p>
+    <w:p>
+      <w:pPr/>
+      <w:r>
+        <w:t>“Participate in solving this problem. Evaluate candidate approaches against these criteria: (1) feasibility &gt; 0.7, (2) cost &lt; budget, (3) time-to-implement &lt; 2 weeks. Select the FIRST approach that meets all three criteria. Present your selection with a 100-word justification. Do not continue evaluating after finding a satisfactory solution.”</w:t>
+      </w:r>
+    </w:p>
+    <w:p>
+      <w:pPr/>
+      <w:r>
+        <w:t>Design Principle 3 (Satisficing Stopping Rule): High-autonomy prompts must include explicit stopping criteria. The agent should terminate analysis upon finding a solution that meets predefined thresholds, rather than exhaustively exploring the solution space. This directly counters the LLM tendency toward exhaustive elaboration.</w:t>
+      </w:r>
+    </w:p>
+    <w:p>
+      <w:pPr>
+        <w:pStyle w:val="Heading3"/>
+      </w:pPr>
+      <w:r>
+        <w:t>Mapping 4: Informational Roles → Information Filtering Protocol</w:t>
+      </w:r>
+    </w:p>
+    <w:p>
+      <w:pPr/>
+      <w:r>
+        <w:t>Mintzberg identified three informational roles for managers: monitor (scanning for relevant information), disseminator (forwarding information to subordinates), and spokesperson (transmitting information to outsiders) (Mintzberg, 1973). Critically, the monitor role is not about collecting all information—it is about selective attention to strategically relevant signals.</w:t>
+      </w:r>
+    </w:p>
+    <w:p>
+      <w:pPr/>
+      <w:r>
+        <w:t>Engineering mapping: Define an explicit information filter in the prompt that specifies what constitutes high-value vs. low-value output.</w:t>
+      </w:r>
+    </w:p>
+    <w:p>
+      <w:pPr/>
+      <w:r>
+        <w:t>Unconstrained S4:</w:t>
+      </w:r>
+    </w:p>
+    <w:p>
+      <w:pPr/>
+      <w:r>
+        <w:t>“Design a database schema for this e-commerce platform. Provide a thorough analysis.”</w:t>
+      </w:r>
+    </w:p>
+    <w:p>
+      <w:pPr/>
+      <w:r>
+        <w:t>Filter-constrained S4:</w:t>
+      </w:r>
+    </w:p>
+    <w:p>
+      <w:pPr/>
+      <w:r>
+        <w:t>“Design a database schema for this e-commerce platform. Your output must prioritize:</w:t>
+        <w:br/>
+        <w:t>HIGH VALUE: Schema design decisions that affect query performance (&gt;10ms impact), data integrity constraints, and scalability bottlenecks.</w:t>
+        <w:br/>
+        <w:t>LOW VALUE (omit): Generic best practices, obvious design choices, and implementation details that don’t affect the architecture.</w:t>
+        <w:br/>
+        <w:t>Focus your analysis on the top 3 highest-impact decisions only.”</w:t>
+      </w:r>
+    </w:p>
+    <w:p>
+      <w:pPr/>
+      <w:r>
+        <w:t>Design Principle 4 (Information Filtering): High-autonomy prompts must include an explicit value hierarchy that distinguishes high-value from low-value information. The agent should allocate output length proportional to information value, not uniformly across all aspects.</w:t>
+      </w:r>
+    </w:p>
+    <w:p>
+      <w:pPr>
+        <w:pStyle w:val="Heading3"/>
+      </w:pPr>
+      <w:r>
+        <w:t>2.5.4 Unified Constrained Delegation Prompt Template</w:t>
+      </w:r>
+    </w:p>
+    <w:p>
+      <w:pPr/>
+      <w:r>
+        <w:t>Integrating the four mappings, we propose a unified prompt template for constrained high-autonomy instructions:</w:t>
+      </w:r>
+    </w:p>
+    <w:p>
+      <w:pPr/>
+      <w:r>
+        <w:t>Template: Constrained S4 (Delegating) Prompt</w:t>
+      </w:r>
+    </w:p>
+    <w:p>
+      <w:pPr/>
+      <w:r>
+        <w:t>“You are a senior agent with readiness level R4. Handle this task independently.</w:t>
+        <w:br/>
+        <w:br/>
+        <w:t>OBJECTIVE: [specific, measurable goal]</w:t>
+        <w:br/>
+        <w:br/>
+        <w:t>OUTPUT STRUCTURE (A3 Protocol):</w:t>
+        <w:br/>
+        <w:t>- Problem Statement: ≤ [N1] words</w:t>
+        <w:br/>
+        <w:t>- Key Analysis: ≤ [N2] words, max [K] points</w:t>
+        <w:br/>
+        <w:t>- Recommendation: ≤ [N3] words</w:t>
+        <w:br/>
+        <w:t>- Next Steps: ≤ [N4] words</w:t>
+        <w:br/>
+        <w:t>- Total: must not exceed [T] words</w:t>
+        <w:br/>
+        <w:br/>
+        <w:t>DEVIATION FILTER (MBE):</w:t>
+        <w:br/>
+        <w:t>- Report routine items as one-line status.</w:t>
+        <w:br/>
+        <w:t>- Elaborate ONLY on items that deviate from: [criteria]</w:t>
+        <w:br/>
+        <w:t>- Max deviations to discuss: [D]</w:t>
+        <w:br/>
+        <w:br/>
+        <w:t>STOPPING RULE (Satisficing):</w:t>
+        <w:br/>
+        <w:t>- Stop analysis upon finding a solution that meets: [thresholds]</w:t>
+        <w:br/>
+        <w:t>- Do not continue evaluating after finding a satisfactory option.</w:t>
+        <w:br/>
+        <w:br/>
+        <w:t>VALUE HIERARCHY (Information Filter):</w:t>
+        <w:br/>
+        <w:t>- HIGH VALUE: [criteria]</w:t>
+        <w:br/>
+        <w:t>- LOW VALUE (omit): [criteria]</w:t>
+        <w:br/>
+        <w:t>- Allocate detail proportional to value.”</w:t>
+      </w:r>
+    </w:p>
+    <w:p>
+      <w:pPr>
+        <w:pStyle w:val="Heading3"/>
+      </w:pPr>
+      <w:r>
+        <w:t>2.5.5 Model-Agnostic Implementation</w:t>
+      </w:r>
+    </w:p>
+    <w:p>
+      <w:pPr/>
+      <w:r>
+        <w:t>The proposed design principles are model-agnostic—they rely on prompt-level constraints rather than model-specific features. Implementation requires no fine-tuning, no special API parameters, and no model-specific workarounds. The approach works with any instruction-following LLM (GPT-4, Claude, MiMo, Llama, etc.) because it leverages a universal property: LLMs respond to structural cues in prompts.</w:t>
+      </w:r>
+    </w:p>
+    <w:p>
+      <w:pPr/>
+      <w:r>
+        <w:t>Implementation strategy:</w:t>
+      </w:r>
+    </w:p>
+    <w:p>
+      <w:pPr/>
+      <w:r>
+        <w:t>1. Prompt-layer integration: Embed the constrained template into the AOM-DT style assignment logic. When the readiness calculator assigns S3 or S4, the system automatically appends the appropriate constraints (A3 structure, MBE filter, satisficing threshold, information hierarchy) to the base instruction.</w:t>
+      </w:r>
+    </w:p>
+    <w:p>
+      <w:pPr/>
+      <w:r>
+        <w:t>2. Token budget calibration: The word limits [N1]-[N4] and total [T] should be calibrated per task uncertainty level. Based on our V3 data, we propose:</w:t>
+      </w:r>
+    </w:p>
+    <w:p>
+      <w:pPr/>
+      <w:r>
+        <w:t xml:space="preserve">   Low uncertainty (0.1): T = 500 words (≈ 650 tokens)</w:t>
+      </w:r>
+    </w:p>
+    <w:p>
+      <w:pPr/>
+      <w:r>
+        <w:t xml:space="preserve">   Medium uncertainty (0.5): T = 800 words (≈ 1040 tokens)</w:t>
+      </w:r>
+    </w:p>
+    <w:p>
+      <w:pPr/>
+      <w:r>
+        <w:t xml:space="preserve">   High uncertainty (0.9): T = 1200 words (≈ 1560 tokens)</w:t>
+      </w:r>
+    </w:p>
+    <w:p>
+      <w:pPr/>
+      <w:r>
+        <w:t>3. Deviation criteria specification: The MBE deviation criteria should be derived from the task specification. For each task, the coordinator agent (Agent D) generates task-specific success criteria during the coordination phase, which are then passed to workers as MBE baselines.</w:t>
+      </w:r>
+    </w:p>
+    <w:p>
+      <w:pPr/>
+      <w:r>
+        <w:t>4. Graceful degradation: If the LLM exceeds the word budget, the system should truncate at the budget boundary and append a note: [Output truncated at word budget. Key remaining points: ...] This ensures the constraint is enforced even when the LLM does not perfectly comply.</w:t>
+      </w:r>
+    </w:p>
+    <w:p>
+      <w:pPr>
+        <w:pStyle w:val="Heading3"/>
+      </w:pPr>
+      <w:r>
+        <w:t>2.5.6 Theoretical Synthesis: From Verbosity Control to Optimal Information Flow</w:t>
+      </w:r>
+    </w:p>
+    <w:p>
+      <w:pPr/>
+      <w:r>
+        <w:t>The four management theories converge on a unified principle: optimal information flow requires explicit constraints on what, when, and how much to communicate. In human organizations, these constraints are internalized through training, culture, and professional norms. LLMs lack this internalization—their training (pre-training on internet text) optimizes for fluency and comprehensiveness, not for concise, targeted communication under organizational constraints.</w:t>
+      </w:r>
+    </w:p>
+    <w:p>
+      <w:pPr/>
+      <w:r>
+        <w:t>The proposed solution externalizes these constraints into the prompt itself. This is analogous to how organizations use standardized reporting templates, communication protocols, and performance dashboards to govern information flow—tools that Fayol (1916) would recognize as extensions of the unity of direction principle.</w:t>
+      </w:r>
+    </w:p>
+    <w:p>
+      <w:pPr/>
+      <w:r>
+        <w:t>Formally, let V(S, L) denote the verbosity of LLM L under instruction style S. The autonomy-verbosity trade-off observed in V3 can be expressed as:</w:t>
+      </w:r>
+    </w:p>
+    <w:p>
+      <w:pPr/>
+      <w:r>
+        <w:t>V(S4, L) &gt; V(S1, L)  for current LLMs   ... (1)</w:t>
+      </w:r>
+    </w:p>
+    <w:p>
+      <w:pPr/>
+      <w:r>
+        <w:t>The constrained delegation approach aims to achieve:</w:t>
+      </w:r>
+    </w:p>
+    <w:p>
+      <w:pPr/>
+      <w:r>
+        <w:t>V(S4_constrained, L) ≈ V(S1, L)  while preserving  Quality(S4, L) ≥ Quality(S1, L)   ... (2)</w:t>
+      </w:r>
+    </w:p>
+    <w:p>
+      <w:pPr/>
+      <w:r>
+        <w:t>Equation (2) states the design goal: constrained high-autonomy prompts should match the token efficiency of low-autonomy prompts while preserving the quality advantages of autonomous execution. This is achievable because the verbosity in S4 is not caused by the task’s inherent complexity—it is an artifact of unconstrained generation. The task’s information content is fixed; only the output format changes.</w:t>
+      </w:r>
+    </w:p>
+    <w:p>
+      <w:pPr/>
+      <w:r>
+        <w:t>We hypothesize that the constrained approach will reduce AOM-DT’s token overhead from +7.0% to within +2% of ST, while maintaining the 100% success rate and ~3.9/5 quality observed in V3. This hypothesis is testable in a V4 experiment.</w:t>
       </w:r>
     </w:p>
     <w:p>
@@ -2073,6 +2548,30 @@
       </w:r>
     </w:p>
     <w:p>
+      <w:pPr/>
+      <w:r>
+        <w:t>This paper began with a proposition: that the accumulated wisdom of management science can be compiled into the native collaboration protocols of multi-agent systems. Three versions, 90 experiments, and one counterintuitive trade-off later, we arrive not at a conclusion but at a beginning. The true promise of AOM is not merely that it works—it is what it makes possible.</w:t>
+      </w:r>
+    </w:p>
+    <w:p>
+      <w:pPr/>
+      <w:r>
+        <w:t>We envision a future in which every individual commands their own agent team: a coordinator agent that decomposes intent into tasks, specialist agents that execute in parallel, and a leadership style that adapts in real time to task complexity and agent readiness. This vision extends Hersey and Blanchard from the organizational chart to the human-agent interface—where every person becomes a manager, not by title, but by necessity. Just as a seasoned executive translates strategy into execution through a chain of command, an individual equipped with AOM translates intention into outcome through a chain of agents.</w:t>
+      </w:r>
+    </w:p>
+    <w:p>
+      <w:pPr/>
+      <w:r>
+        <w:t>The implications are structural. When a single person, aided by a well-orchestrated agent team, can decompose complex problems, execute sub-tasks in parallel, synthesize results, and deliver structured output—capabilities that previously required an entire organization—the unit of productive capacity shifts from the firm to the individual. A graduate student can deploy a literature review team. A small business owner can coordinate supply, marketing, and customer service simultaneously. A solo developer can architect, implement, test, and document a system at the pace of a full engineering team. This is not incremental efficiency gain; it is a structural transformation of what one person can accomplish.</w:t>
+      </w:r>
+    </w:p>
+    <w:p>
+      <w:pPr/>
+      <w:r>
+        <w:t>Our ultimate aspiration for AOM is this: to make organizational intelligence a tool available to everyone, not just those who manage corporations. When the farmer can coordinate an agent team as fluently as the CEO coordinates a department—when management science is no longer a course in a business school but a capability embedded in every AI assistant—the promise of agent organizational management will be fulfilled. The age of the one-person enterprise, powered by the compiled wisdom of a century of management thought, has begun.</w:t>
+      </w:r>
+    </w:p>
+    <w:p>
       <w:pPr>
         <w:pStyle w:val="Heading1"/>
       </w:pPr>
@@ -2102,6 +2601,46 @@
       </w:pPr>
       <w:r>
         <w:t>Xi, Z., et al. (2023). The Rise and Potential of Large Language Model Based Agents: A Survey. arXiv:2309.07864.</w:t>
+      </w:r>
+    </w:p>
+    <w:p>
+      <w:pPr>
+        <w:pStyle w:val="ListNumber"/>
+      </w:pPr>
+      <w:r>
+        <w:t>Shook, J. (2008). Managing to Learn: Using the A3 Management Process. Lean Enterprise Institute.</w:t>
+      </w:r>
+    </w:p>
+    <w:p>
+      <w:pPr>
+        <w:pStyle w:val="ListNumber"/>
+      </w:pPr>
+      <w:r>
+        <w:t>Simon, H. A. (1955). A Behavioral Model of Rational Choice. Quarterly Journal of Economics, 69(1), 99–118.</w:t>
+      </w:r>
+    </w:p>
+    <w:p>
+      <w:pPr>
+        <w:pStyle w:val="ListNumber"/>
+      </w:pPr>
+      <w:r>
+        <w:t>Mintzberg, H. (1973). The Nature of Managerial Work. Harper &amp; Row.</w:t>
+      </w:r>
+    </w:p>
+    <w:p>
+      <w:pPr>
+        <w:pStyle w:val="ListNumber"/>
+      </w:pPr>
+      <w:r>
+        <w:t>Fayol, H. (1916). Administration Industrielle et Generale. Dunod.</w:t>
+      </w:r>
+    </w:p>
+    <w:p>
+      <w:pPr>
+        <w:pStyle w:val="ListNumber"/>
+      </w:pPr>
+      <w:r>
+        <w:t>Drucker, P. F. (1954). The Practice of Management. Harper &amp; Row.</w:t>
       </w:r>
     </w:p>
     <w:sectPr>

</xml_diff>